<commit_message>
sửa cấu trúc thư mục
</commit_message>
<xml_diff>
--- a/others/ADY201m_Project_Planning_Template_FA26.docx
+++ b/others/ADY201m_Project_Planning_Template_FA26.docx
@@ -81,7 +81,7 @@
     </w:p>
     <w:p>
       <w:pPr>
-        <w:pStyle w:val="Heading1"/>
+        <w:pStyle w:val="u1"/>
         <w:keepNext/>
       </w:pPr>
       <w:r>
@@ -261,6 +261,9 @@
             <w:pPr>
               <w:spacing w:after="40" w:line="300" w:lineRule="auto"/>
             </w:pPr>
+            <w:r>
+              <w:t>ADY201m_AI2108_FA26_S1_P203_T36</w:t>
+            </w:r>
           </w:p>
         </w:tc>
       </w:tr>
@@ -320,6 +323,9 @@
             <w:pPr>
               <w:spacing w:after="40" w:line="300" w:lineRule="auto"/>
             </w:pPr>
+            <w:r>
+              <w:t>Lê Võ Minh Thư</w:t>
+            </w:r>
           </w:p>
         </w:tc>
       </w:tr>
@@ -379,6 +385,9 @@
             <w:pPr>
               <w:spacing w:after="40" w:line="300" w:lineRule="auto"/>
             </w:pPr>
+            <w:r>
+              <w:t>Nhóm 2</w:t>
+            </w:r>
           </w:p>
         </w:tc>
       </w:tr>
@@ -437,7 +446,34 @@
           <w:p>
             <w:pPr>
               <w:spacing w:after="40" w:line="300" w:lineRule="auto"/>
-            </w:pPr>
+              <w:rPr>
+                <w:lang w:val="fr-FR"/>
+              </w:rPr>
+            </w:pPr>
+            <w:r>
+              <w:rPr>
+                <w:lang w:val="fr-FR"/>
+              </w:rPr>
+              <w:t xml:space="preserve">Nguyễn Minh Quân – SE210130 </w:t>
+            </w:r>
+            <w:r>
+              <w:rPr>
+                <w:lang w:val="fr-FR"/>
+              </w:rPr>
+              <w:t>–</w:t>
+            </w:r>
+            <w:r>
+              <w:rPr>
+                <w:lang w:val="fr-FR"/>
+              </w:rPr>
+              <w:t xml:space="preserve"> q</w:t>
+            </w:r>
+            <w:r>
+              <w:rPr>
+                <w:lang w:val="fr-FR"/>
+              </w:rPr>
+              <w:t>uannmdt@gmail.com</w:t>
+            </w:r>
           </w:p>
         </w:tc>
       </w:tr>
@@ -497,6 +533,12 @@
             <w:pPr>
               <w:spacing w:after="40" w:line="300" w:lineRule="auto"/>
             </w:pPr>
+            <w:r>
+              <w:t xml:space="preserve">Cao Chí Thành – SE210155 - </w:t>
+            </w:r>
+            <w:r>
+              <w:t>caochithanh2404@gmail.com</w:t>
+            </w:r>
           </w:p>
         </w:tc>
       </w:tr>
@@ -531,7 +573,7 @@
                 <w:sz w:val="20"/>
                 <w:szCs w:val="20"/>
               </w:rPr>
-              <w:t>Thành viên 3 (họ tên, MSSV, email)</w:t>
+              <w:t>Kênh liên lạc nhóm (Zalo, Teams, GitHub)</w:t>
             </w:r>
           </w:p>
         </w:tc>
@@ -556,65 +598,9 @@
             <w:pPr>
               <w:spacing w:after="40" w:line="300" w:lineRule="auto"/>
             </w:pPr>
-          </w:p>
-        </w:tc>
-      </w:tr>
-      <w:tr>
-        <w:trPr>
-          <w:cantSplit/>
-          <w:trHeight w:val="500"/>
-        </w:trPr>
-        <w:tc>
-          <w:tcPr>
-            <w:tcW w:w="2200" w:type="dxa"/>
-            <w:tcBorders>
-              <w:top w:val="single" w:sz="4" w:space="0" w:color="000000"/>
-              <w:left w:val="single" w:sz="4" w:space="0" w:color="000000"/>
-              <w:bottom w:val="single" w:sz="4" w:space="0" w:color="000000"/>
-              <w:right w:val="single" w:sz="4" w:space="0" w:color="000000"/>
-            </w:tcBorders>
-            <w:tcMar>
-              <w:top w:w="60" w:type="dxa"/>
-              <w:left w:w="80" w:type="dxa"/>
-              <w:bottom w:w="60" w:type="dxa"/>
-              <w:right w:w="80" w:type="dxa"/>
-            </w:tcMar>
-            <w:vAlign w:val="center"/>
-          </w:tcPr>
-          <w:p>
-            <w:pPr>
-              <w:spacing w:after="40" w:line="300" w:lineRule="auto"/>
-            </w:pPr>
-            <w:r>
-              <w:rPr>
-                <w:sz w:val="20"/>
-                <w:szCs w:val="20"/>
-              </w:rPr>
-              <w:t>Kênh liên lạc nhóm (Zalo, Teams, GitHub)</w:t>
-            </w:r>
-          </w:p>
-        </w:tc>
-        <w:tc>
-          <w:tcPr>
-            <w:tcW w:w="7160" w:type="dxa"/>
-            <w:tcBorders>
-              <w:top w:val="single" w:sz="4" w:space="0" w:color="000000"/>
-              <w:left w:val="single" w:sz="4" w:space="0" w:color="000000"/>
-              <w:bottom w:val="single" w:sz="4" w:space="0" w:color="000000"/>
-              <w:right w:val="single" w:sz="4" w:space="0" w:color="000000"/>
-            </w:tcBorders>
-            <w:tcMar>
-              <w:top w:w="60" w:type="dxa"/>
-              <w:left w:w="80" w:type="dxa"/>
-              <w:bottom w:w="60" w:type="dxa"/>
-              <w:right w:w="80" w:type="dxa"/>
-            </w:tcMar>
-            <w:vAlign w:val="center"/>
-          </w:tcPr>
-          <w:p>
-            <w:pPr>
-              <w:spacing w:after="40" w:line="300" w:lineRule="auto"/>
-            </w:pPr>
+            <w:r>
+              <w:t>Zalo, GitHub</w:t>
+            </w:r>
           </w:p>
         </w:tc>
       </w:tr>
@@ -626,7 +612,7 @@
     </w:p>
     <w:p>
       <w:pPr>
-        <w:pStyle w:val="Heading1"/>
+        <w:pStyle w:val="u1"/>
         <w:keepNext/>
       </w:pPr>
       <w:r>
@@ -816,6 +802,36 @@
             <w:pPr>
               <w:spacing w:after="40" w:line="300" w:lineRule="auto"/>
             </w:pPr>
+            <w:r>
+              <w:t>2.</w:t>
+            </w:r>
+            <w:r>
+              <w:rPr>
+                <w:sz w:val="20"/>
+                <w:szCs w:val="20"/>
+              </w:rPr>
+              <w:t xml:space="preserve"> </w:t>
+            </w:r>
+            <w:r>
+              <w:t xml:space="preserve">Efficient On-board Remaining Useful Life Prediction for </w:t>
+            </w:r>
+            <w:proofErr w:type="gramStart"/>
+            <w:r>
+              <w:t>Lithium Ion</w:t>
+            </w:r>
+            <w:proofErr w:type="gramEnd"/>
+            <w:r>
+              <w:t xml:space="preserve"> Batteries (LIBs) in UAVs with Transferable Conformal Intervals on NASA Prognostics Data</w:t>
+            </w:r>
+            <w:r>
+              <w:t xml:space="preserve"> (</w:t>
+            </w:r>
+            <w:r>
+              <w:t>Tuổi thọ còn lại của pin UAV bằng mô hình nhẹ và khoảng tin cậy chuyển giao trên dữ liệu NASA</w:t>
+            </w:r>
+            <w:r>
+              <w:t>)</w:t>
+            </w:r>
           </w:p>
         </w:tc>
       </w:tr>
@@ -934,6 +950,9 @@
             <w:pPr>
               <w:spacing w:after="40" w:line="300" w:lineRule="auto"/>
             </w:pPr>
+            <w:r>
+              <w:t>NASA Prognostics Center of Excellence Battery Data Set</w:t>
+            </w:r>
           </w:p>
         </w:tc>
       </w:tr>
@@ -993,6 +1012,9 @@
             <w:pPr>
               <w:spacing w:after="40" w:line="300" w:lineRule="auto"/>
             </w:pPr>
+            <w:r>
+              <w:t>https://www.nasa.gov/content/prognostics-center-of-excellence-data-set-repository</w:t>
+            </w:r>
           </w:p>
         </w:tc>
       </w:tr>
@@ -1170,6 +1192,12 @@
             <w:pPr>
               <w:spacing w:after="40" w:line="300" w:lineRule="auto"/>
             </w:pPr>
+            <w:r>
+              <w:t>2794</w:t>
+            </w:r>
+            <w:r>
+              <w:t xml:space="preserve"> records, 4 attributes, 34 battery cells</w:t>
+            </w:r>
           </w:p>
         </w:tc>
       </w:tr>
@@ -1358,7 +1386,7 @@
     </w:p>
     <w:p>
       <w:pPr>
-        <w:pStyle w:val="Heading1"/>
+        <w:pStyle w:val="u1"/>
         <w:keepNext/>
       </w:pPr>
       <w:r>
@@ -1387,6 +1415,7 @@
           <w:i/>
           <w:iCs/>
         </w:rPr>
+        <w:lastRenderedPageBreak/>
         <w:t>Bảng 3.</w:t>
       </w:r>
       <w:r>
@@ -1653,6 +1682,20 @@
             <w:pPr>
               <w:spacing w:after="40" w:line="300" w:lineRule="auto"/>
             </w:pPr>
+            <w:r>
+              <w:t>W</w:t>
+            </w:r>
+            <w:r>
+              <w:t xml:space="preserve">hich discharge-curve features correlate most with capacity </w:t>
+            </w:r>
+            <w:proofErr w:type="gramStart"/>
+            <w:r>
+              <w:t>fade</w:t>
+            </w:r>
+            <w:r>
+              <w:t xml:space="preserve"> ?</w:t>
+            </w:r>
+            <w:proofErr w:type="gramEnd"/>
           </w:p>
         </w:tc>
         <w:tc>
@@ -1757,7 +1800,6 @@
                 <w:sz w:val="20"/>
                 <w:szCs w:val="20"/>
               </w:rPr>
-              <w:lastRenderedPageBreak/>
               <w:t>RQ2</w:t>
             </w:r>
           </w:p>
@@ -1783,6 +1825,12 @@
             <w:pPr>
               <w:spacing w:after="40" w:line="300" w:lineRule="auto"/>
             </w:pPr>
+            <w:r>
+              <w:t>W</w:t>
+            </w:r>
+            <w:r>
+              <w:t>hich of five lightweight models (ridge on handcrafted features, random forest, LightGBM, a small GRU, and TabPFN) attains the lowest RUL error under an inference budget of ten milliseconds per cycle</w:t>
+            </w:r>
           </w:p>
         </w:tc>
         <w:tc>
@@ -1912,6 +1960,12 @@
             <w:pPr>
               <w:spacing w:after="40" w:line="300" w:lineRule="auto"/>
             </w:pPr>
+            <w:r>
+              <w:t>W</w:t>
+            </w:r>
+            <w:r>
+              <w:t>hether split conformal intervals keep nominal coverage when the model trained on cells aged at one temperature is applied to cells at another</w:t>
+            </w:r>
           </w:p>
         </w:tc>
         <w:tc>
@@ -1992,7 +2046,7 @@
     </w:p>
     <w:p>
       <w:pPr>
-        <w:pStyle w:val="Heading1"/>
+        <w:pStyle w:val="u1"/>
         <w:keepNext/>
       </w:pPr>
       <w:r>
@@ -2620,7 +2674,7 @@
     </w:p>
     <w:p>
       <w:pPr>
-        <w:pStyle w:val="Heading1"/>
+        <w:pStyle w:val="u1"/>
         <w:keepNext/>
       </w:pPr>
       <w:r>
@@ -2649,6 +2703,7 @@
           <w:i/>
           <w:iCs/>
         </w:rPr>
+        <w:lastRenderedPageBreak/>
         <w:t>Bảng 5.</w:t>
       </w:r>
       <w:r>
@@ -3449,7 +3504,6 @@
                 <w:sz w:val="20"/>
                 <w:szCs w:val="20"/>
               </w:rPr>
-              <w:lastRenderedPageBreak/>
               <w:t>5</w:t>
             </w:r>
           </w:p>
@@ -4378,7 +4432,7 @@
     </w:p>
     <w:p>
       <w:pPr>
-        <w:pStyle w:val="Heading1"/>
+        <w:pStyle w:val="u1"/>
         <w:keepNext/>
       </w:pPr>
       <w:r>
@@ -4813,6 +4867,7 @@
                 <w:sz w:val="20"/>
                 <w:szCs w:val="20"/>
               </w:rPr>
+              <w:lastRenderedPageBreak/>
               <w:t>Bước 3: Data Analysis with SQL</w:t>
             </w:r>
           </w:p>
@@ -5314,13 +5369,12 @@
         <w:jc w:val="both"/>
       </w:pPr>
       <w:r>
-        <w:lastRenderedPageBreak/>
         <w:t>Sản phẩm bàn giao cuối kỳ gồm: notebook và mã nguồn (kho GitHub), dashboard, Final Report 10-12 trang theo LaTeX Springer 1 cột, slide theo template ADY201m_Slide_Presentation_Final_Sample.pptx, và file AI Audit Log riêng của từng thành viên.</w:t>
       </w:r>
     </w:p>
     <w:p>
       <w:pPr>
-        <w:pStyle w:val="Heading1"/>
+        <w:pStyle w:val="u1"/>
         <w:keepNext/>
       </w:pPr>
       <w:r>
@@ -5653,11 +5707,15 @@
           <w:p>
             <w:pPr>
               <w:spacing w:after="40" w:line="300" w:lineRule="auto"/>
-            </w:pPr>
-            <w:r>
-              <w:rPr>
-                <w:sz w:val="20"/>
-                <w:szCs w:val="20"/>
+              <w:rPr>
+                <w:lang w:val="fr-FR"/>
+              </w:rPr>
+            </w:pPr>
+            <w:r>
+              <w:rPr>
+                <w:sz w:val="20"/>
+                <w:szCs w:val="20"/>
+                <w:lang w:val="fr-FR"/>
               </w:rPr>
               <w:t>Viết SQL và code Python</w:t>
             </w:r>
@@ -5683,6 +5741,9 @@
           <w:p>
             <w:pPr>
               <w:spacing w:after="40" w:line="300" w:lineRule="auto"/>
+              <w:rPr>
+                <w:lang w:val="fr-FR"/>
+              </w:rPr>
             </w:pPr>
           </w:p>
         </w:tc>
@@ -5706,6 +5767,9 @@
           <w:p>
             <w:pPr>
               <w:spacing w:after="40" w:line="300" w:lineRule="auto"/>
+              <w:rPr>
+                <w:lang w:val="fr-FR"/>
+              </w:rPr>
             </w:pPr>
           </w:p>
         </w:tc>
@@ -5729,6 +5793,9 @@
           <w:p>
             <w:pPr>
               <w:spacing w:after="40" w:line="300" w:lineRule="auto"/>
+              <w:rPr>
+                <w:lang w:val="fr-FR"/>
+              </w:rPr>
             </w:pPr>
           </w:p>
         </w:tc>
@@ -5758,11 +5825,15 @@
           <w:p>
             <w:pPr>
               <w:spacing w:after="40" w:line="300" w:lineRule="auto"/>
-            </w:pPr>
-            <w:r>
-              <w:rPr>
-                <w:sz w:val="20"/>
-                <w:szCs w:val="20"/>
+              <w:rPr>
+                <w:lang w:val="fr-FR"/>
+              </w:rPr>
+            </w:pPr>
+            <w:r>
+              <w:rPr>
+                <w:sz w:val="20"/>
+                <w:szCs w:val="20"/>
+                <w:lang w:val="fr-FR"/>
               </w:rPr>
               <w:t>Tạo biểu đồ và diễn giải</w:t>
             </w:r>
@@ -5788,6 +5859,9 @@
           <w:p>
             <w:pPr>
               <w:spacing w:after="40" w:line="300" w:lineRule="auto"/>
+              <w:rPr>
+                <w:lang w:val="fr-FR"/>
+              </w:rPr>
             </w:pPr>
           </w:p>
         </w:tc>
@@ -5811,6 +5885,9 @@
           <w:p>
             <w:pPr>
               <w:spacing w:after="40" w:line="300" w:lineRule="auto"/>
+              <w:rPr>
+                <w:lang w:val="fr-FR"/>
+              </w:rPr>
             </w:pPr>
           </w:p>
         </w:tc>
@@ -5834,6 +5911,9 @@
           <w:p>
             <w:pPr>
               <w:spacing w:after="40" w:line="300" w:lineRule="auto"/>
+              <w:rPr>
+                <w:lang w:val="fr-FR"/>
+              </w:rPr>
             </w:pPr>
           </w:p>
         </w:tc>
@@ -5863,11 +5943,15 @@
           <w:p>
             <w:pPr>
               <w:spacing w:after="40" w:line="300" w:lineRule="auto"/>
-            </w:pPr>
-            <w:r>
-              <w:rPr>
-                <w:sz w:val="20"/>
-                <w:szCs w:val="20"/>
+              <w:rPr>
+                <w:lang w:val="fr-FR"/>
+              </w:rPr>
+            </w:pPr>
+            <w:r>
+              <w:rPr>
+                <w:sz w:val="20"/>
+                <w:szCs w:val="20"/>
+                <w:lang w:val="fr-FR"/>
               </w:rPr>
               <w:t>Huấn luyện và so sánh mô hình</w:t>
             </w:r>
@@ -5893,6 +5977,9 @@
           <w:p>
             <w:pPr>
               <w:spacing w:after="40" w:line="300" w:lineRule="auto"/>
+              <w:rPr>
+                <w:lang w:val="fr-FR"/>
+              </w:rPr>
             </w:pPr>
           </w:p>
         </w:tc>
@@ -5916,6 +6003,9 @@
           <w:p>
             <w:pPr>
               <w:spacing w:after="40" w:line="300" w:lineRule="auto"/>
+              <w:rPr>
+                <w:lang w:val="fr-FR"/>
+              </w:rPr>
             </w:pPr>
           </w:p>
         </w:tc>
@@ -5939,6 +6029,9 @@
           <w:p>
             <w:pPr>
               <w:spacing w:after="40" w:line="300" w:lineRule="auto"/>
+              <w:rPr>
+                <w:lang w:val="fr-FR"/>
+              </w:rPr>
             </w:pPr>
           </w:p>
         </w:tc>
@@ -5968,11 +6061,15 @@
           <w:p>
             <w:pPr>
               <w:spacing w:after="40" w:line="300" w:lineRule="auto"/>
-            </w:pPr>
-            <w:r>
-              <w:rPr>
-                <w:sz w:val="20"/>
-                <w:szCs w:val="20"/>
+              <w:rPr>
+                <w:lang w:val="fr-FR"/>
+              </w:rPr>
+            </w:pPr>
+            <w:r>
+              <w:rPr>
+                <w:sz w:val="20"/>
+                <w:szCs w:val="20"/>
+                <w:lang w:val="fr-FR"/>
               </w:rPr>
               <w:t>Viết LaTeX và tài liệu</w:t>
             </w:r>
@@ -5998,6 +6095,9 @@
           <w:p>
             <w:pPr>
               <w:spacing w:after="40" w:line="300" w:lineRule="auto"/>
+              <w:rPr>
+                <w:lang w:val="fr-FR"/>
+              </w:rPr>
             </w:pPr>
           </w:p>
         </w:tc>
@@ -6021,6 +6121,9 @@
           <w:p>
             <w:pPr>
               <w:spacing w:after="40" w:line="300" w:lineRule="auto"/>
+              <w:rPr>
+                <w:lang w:val="fr-FR"/>
+              </w:rPr>
             </w:pPr>
           </w:p>
         </w:tc>
@@ -6044,6 +6147,9 @@
           <w:p>
             <w:pPr>
               <w:spacing w:after="40" w:line="300" w:lineRule="auto"/>
+              <w:rPr>
+                <w:lang w:val="fr-FR"/>
+              </w:rPr>
             </w:pPr>
           </w:p>
         </w:tc>
@@ -6052,14 +6158,24 @@
     <w:p>
       <w:pPr>
         <w:spacing w:after="120"/>
+        <w:rPr>
+          <w:lang w:val="fr-FR"/>
+        </w:rPr>
       </w:pPr>
     </w:p>
     <w:p>
       <w:pPr>
-        <w:pStyle w:val="Heading1"/>
+        <w:pStyle w:val="u1"/>
         <w:keepNext/>
+        <w:rPr>
+          <w:lang w:val="fr-FR"/>
+        </w:rPr>
       </w:pPr>
       <w:r>
+        <w:rPr>
+          <w:lang w:val="fr-FR"/>
+        </w:rPr>
+        <w:lastRenderedPageBreak/>
         <w:t>8. RỦI RO VÀ PHƯƠNG ÁN DỰ PHÒNG</w:t>
       </w:r>
     </w:p>
@@ -6068,6 +6184,9 @@
         <w:keepNext/>
         <w:spacing w:before="120" w:after="80" w:line="360" w:lineRule="auto"/>
         <w:jc w:val="center"/>
+        <w:rPr>
+          <w:lang w:val="fr-FR"/>
+        </w:rPr>
       </w:pPr>
       <w:r>
         <w:rPr>
@@ -6075,6 +6194,7 @@
           <w:bCs/>
           <w:i/>
           <w:iCs/>
+          <w:lang w:val="fr-FR"/>
         </w:rPr>
         <w:t>Bảng 8.</w:t>
       </w:r>
@@ -6082,6 +6202,7 @@
         <w:rPr>
           <w:i/>
           <w:iCs/>
+          <w:lang w:val="fr-FR"/>
         </w:rPr>
         <w:t xml:space="preserve"> Rủi ro dự kiến và cách xử lý</w:t>
       </w:r>
@@ -6678,7 +6799,7 @@
     </w:p>
     <w:p>
       <w:pPr>
-        <w:pStyle w:val="Heading1"/>
+        <w:pStyle w:val="u1"/>
         <w:keepNext/>
       </w:pPr>
       <w:r>
@@ -8038,11 +8159,11 @@
     <w:lsdException w:name="Unresolved Mention" w:semiHidden="1" w:unhideWhenUsed="1"/>
     <w:lsdException w:name="Smart Link" w:semiHidden="1" w:unhideWhenUsed="1"/>
   </w:latentStyles>
-  <w:style w:type="paragraph" w:default="1" w:styleId="Normal">
+  <w:style w:type="paragraph" w:default="1" w:styleId="Binhthng">
     <w:name w:val="Normal"/>
     <w:qFormat/>
   </w:style>
-  <w:style w:type="paragraph" w:styleId="Heading1">
+  <w:style w:type="paragraph" w:styleId="u1">
     <w:name w:val="heading 1"/>
     <w:uiPriority w:val="9"/>
     <w:qFormat/>
@@ -8058,7 +8179,7 @@
       <w:szCs w:val="26"/>
     </w:rPr>
   </w:style>
-  <w:style w:type="paragraph" w:styleId="Heading2">
+  <w:style w:type="paragraph" w:styleId="u2">
     <w:name w:val="heading 2"/>
     <w:uiPriority w:val="9"/>
     <w:semiHidden/>
@@ -8073,7 +8194,7 @@
       <w:szCs w:val="26"/>
     </w:rPr>
   </w:style>
-  <w:style w:type="paragraph" w:styleId="Heading3">
+  <w:style w:type="paragraph" w:styleId="u3">
     <w:name w:val="heading 3"/>
     <w:uiPriority w:val="9"/>
     <w:semiHidden/>
@@ -8086,7 +8207,7 @@
       <w:color w:val="1F4D78"/>
     </w:rPr>
   </w:style>
-  <w:style w:type="paragraph" w:styleId="Heading4">
+  <w:style w:type="paragraph" w:styleId="u4">
     <w:name w:val="heading 4"/>
     <w:uiPriority w:val="9"/>
     <w:semiHidden/>
@@ -8101,7 +8222,7 @@
       <w:color w:val="2E74B5"/>
     </w:rPr>
   </w:style>
-  <w:style w:type="paragraph" w:styleId="Heading5">
+  <w:style w:type="paragraph" w:styleId="u5">
     <w:name w:val="heading 5"/>
     <w:uiPriority w:val="9"/>
     <w:semiHidden/>
@@ -8114,7 +8235,7 @@
       <w:color w:val="2E74B5"/>
     </w:rPr>
   </w:style>
-  <w:style w:type="paragraph" w:styleId="Heading6">
+  <w:style w:type="paragraph" w:styleId="u6">
     <w:name w:val="heading 6"/>
     <w:uiPriority w:val="9"/>
     <w:semiHidden/>
@@ -8127,13 +8248,12 @@
       <w:color w:val="1F4D78"/>
     </w:rPr>
   </w:style>
-  <w:style w:type="character" w:default="1" w:styleId="DefaultParagraphFont">
+  <w:style w:type="character" w:default="1" w:styleId="Phngmcinhcuaoanvn">
     <w:name w:val="Default Paragraph Font"/>
     <w:uiPriority w:val="1"/>
-    <w:semiHidden/>
     <w:unhideWhenUsed/>
   </w:style>
-  <w:style w:type="table" w:default="1" w:styleId="TableNormal">
+  <w:style w:type="table" w:default="1" w:styleId="BangThngthng">
     <w:name w:val="Normal Table"/>
     <w:uiPriority w:val="99"/>
     <w:semiHidden/>
@@ -8148,13 +8268,13 @@
       </w:tblCellMar>
     </w:tblPr>
   </w:style>
-  <w:style w:type="numbering" w:default="1" w:styleId="NoList">
+  <w:style w:type="numbering" w:default="1" w:styleId="Khngco">
     <w:name w:val="No List"/>
     <w:uiPriority w:val="99"/>
     <w:semiHidden/>
     <w:unhideWhenUsed/>
   </w:style>
-  <w:style w:type="paragraph" w:styleId="Title">
+  <w:style w:type="paragraph" w:styleId="Tiu">
     <w:name w:val="Title"/>
     <w:uiPriority w:val="10"/>
     <w:qFormat/>
@@ -8171,11 +8291,11 @@
       <w:bCs/>
     </w:rPr>
   </w:style>
-  <w:style w:type="paragraph" w:styleId="ListParagraph">
+  <w:style w:type="paragraph" w:styleId="oancuaDanhsach">
     <w:name w:val="List Paragraph"/>
     <w:qFormat/>
   </w:style>
-  <w:style w:type="character" w:styleId="Hyperlink">
+  <w:style w:type="character" w:styleId="Siuktni">
     <w:name w:val="Hyperlink"/>
     <w:uiPriority w:val="99"/>
     <w:unhideWhenUsed/>
@@ -8184,7 +8304,7 @@
       <w:u w:val="single"/>
     </w:rPr>
   </w:style>
-  <w:style w:type="character" w:styleId="FootnoteReference">
+  <w:style w:type="character" w:styleId="ThamchiuCcchu">
     <w:name w:val="footnote reference"/>
     <w:uiPriority w:val="99"/>
     <w:semiHidden/>
@@ -8193,9 +8313,9 @@
       <w:vertAlign w:val="superscript"/>
     </w:rPr>
   </w:style>
-  <w:style w:type="paragraph" w:styleId="FootnoteText">
+  <w:style w:type="paragraph" w:styleId="VnbanCcchu">
     <w:name w:val="footnote text"/>
-    <w:link w:val="FootnoteTextChar"/>
+    <w:link w:val="VnbanCcchuChar"/>
     <w:uiPriority w:val="99"/>
     <w:semiHidden/>
     <w:unhideWhenUsed/>
@@ -8204,9 +8324,9 @@
       <w:szCs w:val="20"/>
     </w:rPr>
   </w:style>
-  <w:style w:type="character" w:customStyle="1" w:styleId="FootnoteTextChar">
-    <w:name w:val="Footnote Text Char"/>
-    <w:link w:val="FootnoteText"/>
+  <w:style w:type="character" w:customStyle="1" w:styleId="VnbanCcchuChar">
+    <w:name w:val="Văn bản Cước chú Char"/>
+    <w:link w:val="VnbanCcchu"/>
     <w:uiPriority w:val="99"/>
     <w:semiHidden/>
     <w:unhideWhenUsed/>
@@ -8215,7 +8335,7 @@
       <w:szCs w:val="20"/>
     </w:rPr>
   </w:style>
-  <w:style w:type="character" w:styleId="EndnoteReference">
+  <w:style w:type="character" w:styleId="ThamchiuChuthichcui">
     <w:name w:val="endnote reference"/>
     <w:uiPriority w:val="99"/>
     <w:semiHidden/>
@@ -8224,9 +8344,9 @@
       <w:vertAlign w:val="superscript"/>
     </w:rPr>
   </w:style>
-  <w:style w:type="paragraph" w:styleId="EndnoteText">
+  <w:style w:type="paragraph" w:styleId="VnbanChuthichcui">
     <w:name w:val="endnote text"/>
-    <w:link w:val="EndnoteTextChar"/>
+    <w:link w:val="VnbanChuthichcuiChar"/>
     <w:uiPriority w:val="99"/>
     <w:semiHidden/>
     <w:unhideWhenUsed/>
@@ -8235,15 +8355,27 @@
       <w:szCs w:val="20"/>
     </w:rPr>
   </w:style>
-  <w:style w:type="character" w:customStyle="1" w:styleId="EndnoteTextChar">
-    <w:name w:val="Endnote Text Char"/>
-    <w:link w:val="EndnoteText"/>
+  <w:style w:type="character" w:customStyle="1" w:styleId="VnbanChuthichcuiChar">
+    <w:name w:val="Văn bản Chú thích cuối Char"/>
+    <w:link w:val="VnbanChuthichcui"/>
     <w:uiPriority w:val="99"/>
     <w:semiHidden/>
     <w:unhideWhenUsed/>
     <w:rPr>
       <w:sz w:val="20"/>
       <w:szCs w:val="20"/>
+    </w:rPr>
+  </w:style>
+  <w:style w:type="character" w:styleId="cpChagiiquyt">
+    <w:name w:val="Unresolved Mention"/>
+    <w:basedOn w:val="Phngmcinhcuaoanvn"/>
+    <w:uiPriority w:val="99"/>
+    <w:semiHidden/>
+    <w:unhideWhenUsed/>
+    <w:rsid w:val="00EC3084"/>
+    <w:rPr>
+      <w:color w:val="605E5C"/>
+      <w:shd w:val="clear" w:color="auto" w:fill="E1DFDD"/>
     </w:rPr>
   </w:style>
 </w:styles>

</xml_diff>